<commit_message>
Use the site purple for headings, and lay the figures out properly
Headings take the logo purple, lightened at display sizes and left
undiluted at Heading 3 where the type is small enough to need it.

Six square figures stacked one per row was nearly three pages of pictures
and ran the report to nine. Pairing them side by side, dropping the
keep_together that made a figure jump a page rather than sit at the foot of
one, and tightening the margins brings it to six. Figures are numbered, and
table headers now repeat across page breaks.

Two figures were in the wrong place. The clock tree sat under the physical
results rather than beside the timing it explains, and the register file
image made a claim about 992 flops that no paragraph in the document set
up. Both fixed, and the area finding it illustrates is now in the text,
parsed from the summary report rather than transcribed.
</commit_message>
<xml_diff>
--- a/pipelined-cpu-physical-design/docs/pnr-report-00-baseline.docx
+++ b/pipelined-cpu-physical-design/docs/pnr-report-00-baseline.docx
@@ -11,7 +11,7 @@
           <w:rFonts w:ascii="Consolas" w:hAnsi="Consolas"/>
           <w:b/>
           <w:caps/>
-          <w:color w:val="9C5A26"/>
+          <w:color w:val="7B47D4"/>
           <w:sz w:val="16"/>
         </w:rPr>
         <w:t>PHYSICAL DESIGN REPORT</w:t>
@@ -210,11 +210,14 @@
         </w:tblBorders>
       </w:tblPr>
       <w:tblGrid>
-        <w:gridCol w:w="3024"/>
-        <w:gridCol w:w="3024"/>
-        <w:gridCol w:w="3024"/>
+        <w:gridCol w:w="3120"/>
+        <w:gridCol w:w="3120"/>
+        <w:gridCol w:w="3120"/>
       </w:tblGrid>
       <w:tr>
+        <w:trPr>
+          <w:tblHeader w:val="true"/>
+        </w:trPr>
         <w:tc>
           <w:tcPr>
             <w:tcW w:type="dxa" w:w="3024"/>
@@ -911,7 +914,8 @@
     </w:tbl>
     <w:p>
       <w:pPr>
-        <w:spacing w:before="80" w:after="240"/>
+        <w:keepLines/>
+        <w:spacing w:before="80" w:after="180"/>
       </w:pPr>
       <w:r>
         <w:rPr>
@@ -924,13 +928,14 @@
     </w:p>
     <w:p>
       <w:pPr>
-        <w:spacing w:before="160" w:after="40"/>
+        <w:keepNext/>
+        <w:spacing w:before="140" w:after="40"/>
         <w:jc w:val="center"/>
       </w:pPr>
       <w:r>
         <w:drawing>
           <wp:inline xmlns:a="http://schemas.openxmlformats.org/drawingml/2006/main" xmlns:pic="http://schemas.openxmlformats.org/drawingml/2006/picture">
-            <wp:extent cx="5486400" cy="5407497"/>
+            <wp:extent cx="2834640" cy="2793873"/>
             <wp:docPr id="1" name="Picture 1"/>
             <wp:cNvGraphicFramePr>
               <a:graphicFrameLocks noChangeAspect="1"/>
@@ -951,7 +956,7 @@
                   <pic:spPr>
                     <a:xfrm>
                       <a:off x="0" y="0"/>
-                      <a:ext cx="5486400" cy="5407497"/>
+                      <a:ext cx="2834640" cy="2793873"/>
                     </a:xfrm>
                     <a:prstGeom prst="rect"/>
                   </pic:spPr>
@@ -964,7 +969,8 @@
     </w:p>
     <w:p>
       <w:pPr>
-        <w:spacing w:before="80" w:after="240"/>
+        <w:keepLines/>
+        <w:spacing w:before="80" w:after="180"/>
       </w:pPr>
       <w:r>
         <w:rPr>
@@ -972,7 +978,7 @@
           <w:color w:val="6E7784"/>
           <w:sz w:val="17"/>
         </w:rPr>
-        <w:t>The routed core. Standard cells in rows, signal routing on metal2 through metal6, and the power ring on metal8 and metal9.</w:t>
+        <w:t>Figure 1. The routed core. Standard cells in rows, signal routing on metal2 through metal6, and the power ring on metal8 and metal9.</w:t>
       </w:r>
     </w:p>
     <w:p>
@@ -1003,11 +1009,14 @@
         </w:tblBorders>
       </w:tblPr>
       <w:tblGrid>
-        <w:gridCol w:w="3024"/>
-        <w:gridCol w:w="3024"/>
-        <w:gridCol w:w="3024"/>
+        <w:gridCol w:w="3120"/>
+        <w:gridCol w:w="3120"/>
+        <w:gridCol w:w="3120"/>
       </w:tblGrid>
       <w:tr>
+        <w:trPr>
+          <w:tblHeader w:val="true"/>
+        </w:trPr>
         <w:tc>
           <w:tcPr>
             <w:tcW w:type="dxa" w:w="720"/>
@@ -1525,7 +1534,8 @@
     </w:tbl>
     <w:p>
       <w:pPr>
-        <w:spacing w:before="80" w:after="240"/>
+        <w:keepLines/>
+        <w:spacing w:before="80" w:after="180"/>
       </w:pPr>
       <w:r>
         <w:rPr>
@@ -1569,12 +1579,15 @@
         </w:tblBorders>
       </w:tblPr>
       <w:tblGrid>
-        <w:gridCol w:w="2268"/>
-        <w:gridCol w:w="2268"/>
-        <w:gridCol w:w="2268"/>
-        <w:gridCol w:w="2268"/>
+        <w:gridCol w:w="2340"/>
+        <w:gridCol w:w="2340"/>
+        <w:gridCol w:w="2340"/>
+        <w:gridCol w:w="2340"/>
       </w:tblGrid>
       <w:tr>
+        <w:trPr>
+          <w:tblHeader w:val="true"/>
+        </w:trPr>
         <w:tc>
           <w:tcPr>
             <w:tcW w:type="dxa" w:w="2160"/>
@@ -1951,7 +1964,8 @@
     </w:tbl>
     <w:p>
       <w:pPr>
-        <w:spacing w:before="80" w:after="240"/>
+        <w:keepLines/>
+        <w:spacing w:before="80" w:after="180"/>
       </w:pPr>
       <w:r>
         <w:rPr>
@@ -2012,12 +2026,15 @@
         </w:tblBorders>
       </w:tblPr>
       <w:tblGrid>
-        <w:gridCol w:w="2268"/>
-        <w:gridCol w:w="2268"/>
-        <w:gridCol w:w="2268"/>
-        <w:gridCol w:w="2268"/>
+        <w:gridCol w:w="2340"/>
+        <w:gridCol w:w="2340"/>
+        <w:gridCol w:w="2340"/>
+        <w:gridCol w:w="2340"/>
       </w:tblGrid>
       <w:tr>
+        <w:trPr>
+          <w:tblHeader w:val="true"/>
+        </w:trPr>
         <w:tc>
           <w:tcPr>
             <w:tcW w:type="dxa" w:w="2160"/>
@@ -2403,7 +2420,8 @@
     </w:tbl>
     <w:p>
       <w:pPr>
-        <w:spacing w:before="80" w:after="240"/>
+        <w:keepLines/>
+        <w:spacing w:before="80" w:after="180"/>
       </w:pPr>
       <w:r>
         <w:rPr>
@@ -2426,57 +2444,150 @@
       </w:r>
     </w:p>
     <w:p>
-      <w:pPr>
-        <w:spacing w:before="160" w:after="40"/>
-        <w:jc w:val="center"/>
-      </w:pPr>
       <w:r>
-        <w:drawing>
-          <wp:inline xmlns:a="http://schemas.openxmlformats.org/drawingml/2006/main" xmlns:pic="http://schemas.openxmlformats.org/drawingml/2006/picture">
-            <wp:extent cx="5486400" cy="5426567"/>
-            <wp:docPr id="2" name="Picture 2"/>
-            <wp:cNvGraphicFramePr>
-              <a:graphicFrameLocks noChangeAspect="1"/>
-            </wp:cNvGraphicFramePr>
-            <a:graphic>
-              <a:graphicData uri="http://schemas.openxmlformats.org/drawingml/2006/picture">
-                <pic:pic>
-                  <pic:nvPicPr>
-                    <pic:cNvPr id="0" name="die-critical-path.png"/>
-                    <pic:cNvPicPr/>
-                  </pic:nvPicPr>
-                  <pic:blipFill>
-                    <a:blip r:embed="rId11"/>
-                    <a:stretch>
-                      <a:fillRect/>
-                    </a:stretch>
-                  </pic:blipFill>
-                  <pic:spPr>
-                    <a:xfrm>
-                      <a:off x="0" y="0"/>
-                      <a:ext cx="5486400" cy="5426567"/>
-                    </a:xfrm>
-                    <a:prstGeom prst="rect"/>
-                  </pic:spPr>
-                </pic:pic>
-              </a:graphicData>
-            </a:graphic>
-          </wp:inline>
-        </w:drawing>
+        <w:rPr>
+          <w:b/>
+        </w:rPr>
+        <w:t xml:space="preserve">Where the time actually goes. </w:t>
+      </w:r>
+      <w:r>
+        <w:t>The worst path launches from a register in MEM/WB, crosses the forwarding unit that decides EX must take a forwarded value rather than the register file's, and then ripples the carry across all 32 bits of the ALU adder before being captured in EX/MEM. Of the 2.863 ns that path takes, 2.123 ns is the carry chain alone: 74 percent of the clock period sits in one ripple-carry adder. That is the single change worth making to the design, and the adder is under 3 percent of the area, so speed there is cheap.</w:t>
       </w:r>
     </w:p>
+    <w:tbl>
+      <w:tblPr>
+        <w:tblW w:type="auto" w:w="0"/>
+        <w:jc w:val="center"/>
+        <w:tblLayout w:type="fixed"/>
+        <w:tblLook w:firstColumn="1" w:firstRow="1" w:lastColumn="0" w:lastRow="0" w:noHBand="0" w:noVBand="1" w:val="04A0"/>
+      </w:tblPr>
+      <w:tblGrid>
+        <w:gridCol w:w="4680"/>
+        <w:gridCol w:w="4680"/>
+      </w:tblGrid>
+      <w:tr>
+        <w:tc>
+          <w:tcPr>
+            <w:tcW w:type="dxa" w:w="4392"/>
+          </w:tcPr>
+          <w:p>
+            <w:pPr>
+              <w:spacing w:after="40" w:before="80"/>
+              <w:jc w:val="center"/>
+            </w:pPr>
+            <w:r>
+              <w:drawing>
+                <wp:inline xmlns:a="http://schemas.openxmlformats.org/drawingml/2006/main" xmlns:pic="http://schemas.openxmlformats.org/drawingml/2006/picture">
+                  <wp:extent cx="2606040" cy="2568561"/>
+                  <wp:docPr id="2" name="Picture 2"/>
+                  <wp:cNvGraphicFramePr>
+                    <a:graphicFrameLocks noChangeAspect="1"/>
+                  </wp:cNvGraphicFramePr>
+                  <a:graphic>
+                    <a:graphicData uri="http://schemas.openxmlformats.org/drawingml/2006/picture">
+                      <pic:pic>
+                        <pic:nvPicPr>
+                          <pic:cNvPr id="0" name="clock-tree.png"/>
+                          <pic:cNvPicPr/>
+                        </pic:nvPicPr>
+                        <pic:blipFill>
+                          <a:blip r:embed="rId11"/>
+                          <a:stretch>
+                            <a:fillRect/>
+                          </a:stretch>
+                        </pic:blipFill>
+                        <pic:spPr>
+                          <a:xfrm>
+                            <a:off x="0" y="0"/>
+                            <a:ext cx="2606040" cy="2568561"/>
+                          </a:xfrm>
+                          <a:prstGeom prst="rect"/>
+                        </pic:spPr>
+                      </pic:pic>
+                    </a:graphicData>
+                  </a:graphic>
+                </wp:inline>
+              </w:drawing>
+            </w:r>
+          </w:p>
+          <w:p>
+            <w:pPr>
+              <w:spacing w:before="40" w:after="80"/>
+            </w:pPr>
+            <w:r>
+              <w:rPr>
+                <w:i/>
+                <w:color w:val="6E7784"/>
+                <w:sz w:val="16"/>
+              </w:rPr>
+              <w:t>Figure 2. The synthesised clock tree driving every flip-flop in the design.</w:t>
+            </w:r>
+          </w:p>
+        </w:tc>
+        <w:tc>
+          <w:tcPr>
+            <w:tcW w:type="dxa" w:w="4392"/>
+          </w:tcPr>
+          <w:p>
+            <w:pPr>
+              <w:spacing w:after="40" w:before="80"/>
+              <w:jc w:val="center"/>
+            </w:pPr>
+            <w:r>
+              <w:drawing>
+                <wp:inline xmlns:a="http://schemas.openxmlformats.org/drawingml/2006/main" xmlns:pic="http://schemas.openxmlformats.org/drawingml/2006/picture">
+                  <wp:extent cx="2606040" cy="2577619"/>
+                  <wp:docPr id="3" name="Picture 3"/>
+                  <wp:cNvGraphicFramePr>
+                    <a:graphicFrameLocks noChangeAspect="1"/>
+                  </wp:cNvGraphicFramePr>
+                  <a:graphic>
+                    <a:graphicData uri="http://schemas.openxmlformats.org/drawingml/2006/picture">
+                      <pic:pic>
+                        <pic:nvPicPr>
+                          <pic:cNvPr id="0" name="die-critical-path.png"/>
+                          <pic:cNvPicPr/>
+                        </pic:nvPicPr>
+                        <pic:blipFill>
+                          <a:blip r:embed="rId12"/>
+                          <a:stretch>
+                            <a:fillRect/>
+                          </a:stretch>
+                        </pic:blipFill>
+                        <pic:spPr>
+                          <a:xfrm>
+                            <a:off x="0" y="0"/>
+                            <a:ext cx="2606040" cy="2577619"/>
+                          </a:xfrm>
+                          <a:prstGeom prst="rect"/>
+                        </pic:spPr>
+                      </pic:pic>
+                    </a:graphicData>
+                  </a:graphic>
+                </wp:inline>
+              </w:drawing>
+            </w:r>
+          </w:p>
+          <w:p>
+            <w:pPr>
+              <w:spacing w:before="40" w:after="80"/>
+            </w:pPr>
+            <w:r>
+              <w:rPr>
+                <w:i/>
+                <w:color w:val="6E7784"/>
+                <w:sz w:val="16"/>
+              </w:rPr>
+              <w:t>Figure 3. The critical path highlighted across the die. It launches in MEM/WB, crosses the forwarding logic and ripples through all 32 bits of the ALU adder before being captured in EX/MEM.</w:t>
+            </w:r>
+          </w:p>
+        </w:tc>
+      </w:tr>
+    </w:tbl>
     <w:p>
       <w:pPr>
-        <w:spacing w:before="80" w:after="240"/>
+        <w:spacing w:after="120"/>
       </w:pPr>
-      <w:r>
-        <w:rPr>
-          <w:i/>
-          <w:color w:val="6E7784"/>
-          <w:sz w:val="17"/>
-        </w:rPr>
-        <w:t>The critical path highlighted across the die. It launches in MEM/WB, crosses the forwarding logic and ripples through all 32 bits of the ALU adder before being captured in EX/MEM.</w:t>
-      </w:r>
     </w:p>
     <w:p>
       <w:r>
@@ -2517,11 +2628,14 @@
         </w:tblBorders>
       </w:tblPr>
       <w:tblGrid>
-        <w:gridCol w:w="3024"/>
-        <w:gridCol w:w="3024"/>
-        <w:gridCol w:w="3024"/>
+        <w:gridCol w:w="3120"/>
+        <w:gridCol w:w="3120"/>
+        <w:gridCol w:w="3120"/>
       </w:tblGrid>
       <w:tr>
+        <w:trPr>
+          <w:tblHeader w:val="true"/>
+        </w:trPr>
         <w:tc>
           <w:tcPr>
             <w:tcW w:type="dxa" w:w="1728"/>
@@ -3183,7 +3297,8 @@
     </w:tbl>
     <w:p>
       <w:pPr>
-        <w:spacing w:before="80" w:after="240"/>
+        <w:keepLines/>
+        <w:spacing w:before="80" w:after="180"/>
       </w:pPr>
       <w:r>
         <w:rPr>
@@ -3192,59 +3307,6 @@
           <w:sz w:val="17"/>
         </w:rPr>
         <w:t>Table 5. Routing by metal layer. metal1 carries no signal because it is reserved for wiring inside the cells and for the power rails. The upper layers are nearly empty because a block this small has no journeys long enough to need them.</w:t>
-      </w:r>
-    </w:p>
-    <w:p>
-      <w:pPr>
-        <w:spacing w:before="160" w:after="40"/>
-        <w:jc w:val="center"/>
-      </w:pPr>
-      <w:r>
-        <w:drawing>
-          <wp:inline xmlns:a="http://schemas.openxmlformats.org/drawingml/2006/main" xmlns:pic="http://schemas.openxmlformats.org/drawingml/2006/picture">
-            <wp:extent cx="5486400" cy="5486400"/>
-            <wp:docPr id="3" name="Picture 3"/>
-            <wp:cNvGraphicFramePr>
-              <a:graphicFrameLocks noChangeAspect="1"/>
-            </wp:cNvGraphicFramePr>
-            <a:graphic>
-              <a:graphicData uri="http://schemas.openxmlformats.org/drawingml/2006/picture">
-                <pic:pic>
-                  <pic:nvPicPr>
-                    <pic:cNvPr id="0" name="die-zoom.png"/>
-                    <pic:cNvPicPr/>
-                  </pic:nvPicPr>
-                  <pic:blipFill>
-                    <a:blip r:embed="rId12"/>
-                    <a:stretch>
-                      <a:fillRect/>
-                    </a:stretch>
-                  </pic:blipFill>
-                  <pic:spPr>
-                    <a:xfrm>
-                      <a:off x="0" y="0"/>
-                      <a:ext cx="5486400" cy="5486400"/>
-                    </a:xfrm>
-                    <a:prstGeom prst="rect"/>
-                  </pic:spPr>
-                </pic:pic>
-              </a:graphicData>
-            </a:graphic>
-          </wp:inline>
-        </w:drawing>
-      </w:r>
-    </w:p>
-    <w:p>
-      <w:pPr>
-        <w:spacing w:before="80" w:after="240"/>
-      </w:pPr>
-      <w:r>
-        <w:rPr>
-          <w:i/>
-          <w:color w:val="6E7784"/>
-          <w:sz w:val="17"/>
-        </w:rPr>
-        <w:t>Detail. Individual standard cells sitting in their rows, with the metal1 power rails running along each row boundary.</w:t>
       </w:r>
     </w:p>
     <w:p>
@@ -3258,16 +3320,163 @@
         <w:t>The power grid is worth seeing on its own, because none of it comes from the netlist. A netlist describes logic and says nothing about how current reaches it. Every ring, strap and rail below was created by three commands in the flow script, and the connection between a cell's power pin and the VDD net exists only because globalNetConnect declared it.</w:t>
       </w:r>
     </w:p>
+    <w:tbl>
+      <w:tblPr>
+        <w:tblW w:type="auto" w:w="0"/>
+        <w:jc w:val="center"/>
+        <w:tblLayout w:type="fixed"/>
+        <w:tblLook w:firstColumn="1" w:firstRow="1" w:lastColumn="0" w:lastRow="0" w:noHBand="0" w:noVBand="1" w:val="04A0"/>
+      </w:tblPr>
+      <w:tblGrid>
+        <w:gridCol w:w="4680"/>
+        <w:gridCol w:w="4680"/>
+      </w:tblGrid>
+      <w:tr>
+        <w:tc>
+          <w:tcPr>
+            <w:tcW w:type="dxa" w:w="4392"/>
+          </w:tcPr>
+          <w:p>
+            <w:pPr>
+              <w:spacing w:after="40" w:before="80"/>
+              <w:jc w:val="center"/>
+            </w:pPr>
+            <w:r>
+              <w:drawing>
+                <wp:inline xmlns:a="http://schemas.openxmlformats.org/drawingml/2006/main" xmlns:pic="http://schemas.openxmlformats.org/drawingml/2006/picture">
+                  <wp:extent cx="2606040" cy="2606040"/>
+                  <wp:docPr id="4" name="Picture 4"/>
+                  <wp:cNvGraphicFramePr>
+                    <a:graphicFrameLocks noChangeAspect="1"/>
+                  </wp:cNvGraphicFramePr>
+                  <a:graphic>
+                    <a:graphicData uri="http://schemas.openxmlformats.org/drawingml/2006/picture">
+                      <pic:pic>
+                        <pic:nvPicPr>
+                          <pic:cNvPr id="0" name="die-zoom.png"/>
+                          <pic:cNvPicPr/>
+                        </pic:nvPicPr>
+                        <pic:blipFill>
+                          <a:blip r:embed="rId13"/>
+                          <a:stretch>
+                            <a:fillRect/>
+                          </a:stretch>
+                        </pic:blipFill>
+                        <pic:spPr>
+                          <a:xfrm>
+                            <a:off x="0" y="0"/>
+                            <a:ext cx="2606040" cy="2606040"/>
+                          </a:xfrm>
+                          <a:prstGeom prst="rect"/>
+                        </pic:spPr>
+                      </pic:pic>
+                    </a:graphicData>
+                  </a:graphic>
+                </wp:inline>
+              </w:drawing>
+            </w:r>
+          </w:p>
+          <w:p>
+            <w:pPr>
+              <w:spacing w:before="40" w:after="80"/>
+            </w:pPr>
+            <w:r>
+              <w:rPr>
+                <w:i/>
+                <w:color w:val="6E7784"/>
+                <w:sz w:val="16"/>
+              </w:rPr>
+              <w:t>Figure 4. Detail. Individual standard cells sitting in their rows, with the metal1 power rails running along each row boundary.</w:t>
+            </w:r>
+          </w:p>
+        </w:tc>
+        <w:tc>
+          <w:tcPr>
+            <w:tcW w:type="dxa" w:w="4392"/>
+          </w:tcPr>
+          <w:p>
+            <w:pPr>
+              <w:spacing w:after="40" w:before="80"/>
+              <w:jc w:val="center"/>
+            </w:pPr>
+            <w:r>
+              <w:drawing>
+                <wp:inline xmlns:a="http://schemas.openxmlformats.org/drawingml/2006/main" xmlns:pic="http://schemas.openxmlformats.org/drawingml/2006/picture">
+                  <wp:extent cx="2606040" cy="2577619"/>
+                  <wp:docPr id="5" name="Picture 5"/>
+                  <wp:cNvGraphicFramePr>
+                    <a:graphicFrameLocks noChangeAspect="1"/>
+                  </wp:cNvGraphicFramePr>
+                  <a:graphic>
+                    <a:graphicData uri="http://schemas.openxmlformats.org/drawingml/2006/picture">
+                      <pic:pic>
+                        <pic:nvPicPr>
+                          <pic:cNvPr id="0" name="power-grid.png"/>
+                          <pic:cNvPicPr/>
+                        </pic:nvPicPr>
+                        <pic:blipFill>
+                          <a:blip r:embed="rId14"/>
+                          <a:stretch>
+                            <a:fillRect/>
+                          </a:stretch>
+                        </pic:blipFill>
+                        <pic:spPr>
+                          <a:xfrm>
+                            <a:off x="0" y="0"/>
+                            <a:ext cx="2606040" cy="2577619"/>
+                          </a:xfrm>
+                          <a:prstGeom prst="rect"/>
+                        </pic:spPr>
+                      </pic:pic>
+                    </a:graphicData>
+                  </a:graphic>
+                </wp:inline>
+              </w:drawing>
+            </w:r>
+          </w:p>
+          <w:p>
+            <w:pPr>
+              <w:spacing w:before="40" w:after="80"/>
+            </w:pPr>
+            <w:r>
+              <w:rPr>
+                <w:i/>
+                <w:color w:val="6E7784"/>
+                <w:sz w:val="16"/>
+              </w:rPr>
+              <w:t>Figure 5. The power grid with signal routing hidden. The ring runs on metal9 and metal8 around the core, vertical straps cross on metal8 every 25 microns, and sroute ties the whole grid down to the metal1 rails running inside every standard cell row.</w:t>
+            </w:r>
+          </w:p>
+        </w:tc>
+      </w:tr>
+    </w:tbl>
     <w:p>
       <w:pPr>
-        <w:spacing w:before="160" w:after="40"/>
+        <w:spacing w:after="120"/>
+      </w:pPr>
+    </w:p>
+    <w:p>
+      <w:r>
+        <w:rPr>
+          <w:b/>
+        </w:rPr>
+        <w:t xml:space="preserve">Where the area actually goes. </w:t>
+      </w:r>
+      <w:r>
+        <w:t>Of the 1,347 flip-flops, 1,023 are SDFF, a cell with a 2x1 multiplexer built into it, which is what an enable-guarded register maps onto. That count is the register file exactly: 31 architectural registers of 32 bits, x0 costing nothing because it is hardwired to zero. Those cells alone are 6275 um2, or 53 percent of all logic area, and the multiplexer tree that reads them adds more. The structure that dominates the area and the structure that dominates the clock are different parts of the design.</w:t>
+      </w:r>
+    </w:p>
+    <w:p>
+      <w:pPr>
+        <w:keepNext/>
+        <w:spacing w:before="140" w:after="40"/>
         <w:jc w:val="center"/>
       </w:pPr>
       <w:r>
         <w:drawing>
           <wp:inline xmlns:a="http://schemas.openxmlformats.org/drawingml/2006/main" xmlns:pic="http://schemas.openxmlformats.org/drawingml/2006/picture">
-            <wp:extent cx="5486400" cy="5426567"/>
-            <wp:docPr id="4" name="Picture 4"/>
+            <wp:extent cx="2468880" cy="2433374"/>
+            <wp:docPr id="6" name="Picture 6"/>
             <wp:cNvGraphicFramePr>
               <a:graphicFrameLocks noChangeAspect="1"/>
             </wp:cNvGraphicFramePr>
@@ -3275,11 +3484,11 @@
               <a:graphicData uri="http://schemas.openxmlformats.org/drawingml/2006/picture">
                 <pic:pic>
                   <pic:nvPicPr>
-                    <pic:cNvPr id="0" name="power-grid.png"/>
+                    <pic:cNvPr id="0" name="die-modules.png"/>
                     <pic:cNvPicPr/>
                   </pic:nvPicPr>
                   <pic:blipFill>
-                    <a:blip r:embed="rId13"/>
+                    <a:blip r:embed="rId15"/>
                     <a:stretch>
                       <a:fillRect/>
                     </a:stretch>
@@ -3287,7 +3496,7 @@
                   <pic:spPr>
                     <a:xfrm>
                       <a:off x="0" y="0"/>
-                      <a:ext cx="5486400" cy="5426567"/>
+                      <a:ext cx="2468880" cy="2433374"/>
                     </a:xfrm>
                     <a:prstGeom prst="rect"/>
                   </pic:spPr>
@@ -3300,7 +3509,8 @@
     </w:p>
     <w:p>
       <w:pPr>
-        <w:spacing w:before="80" w:after="240"/>
+        <w:keepLines/>
+        <w:spacing w:before="80" w:after="180"/>
       </w:pPr>
       <w:r>
         <w:rPr>
@@ -3308,113 +3518,7 @@
           <w:color w:val="6E7784"/>
           <w:sz w:val="17"/>
         </w:rPr>
-        <w:t>The power grid with signal routing hidden. The ring runs on metal9 and metal8 around the core, vertical straps cross on metal8 every 25 microns, and sroute ties the whole grid down to the metal1 rails running inside every standard cell row.</w:t>
-      </w:r>
-    </w:p>
-    <w:p>
-      <w:pPr>
-        <w:spacing w:before="160" w:after="40"/>
-        <w:jc w:val="center"/>
-      </w:pPr>
-      <w:r>
-        <w:drawing>
-          <wp:inline xmlns:a="http://schemas.openxmlformats.org/drawingml/2006/main" xmlns:pic="http://schemas.openxmlformats.org/drawingml/2006/picture">
-            <wp:extent cx="5486400" cy="5407497"/>
-            <wp:docPr id="5" name="Picture 5"/>
-            <wp:cNvGraphicFramePr>
-              <a:graphicFrameLocks noChangeAspect="1"/>
-            </wp:cNvGraphicFramePr>
-            <a:graphic>
-              <a:graphicData uri="http://schemas.openxmlformats.org/drawingml/2006/picture">
-                <pic:pic>
-                  <pic:nvPicPr>
-                    <pic:cNvPr id="0" name="die-modules.png"/>
-                    <pic:cNvPicPr/>
-                  </pic:nvPicPr>
-                  <pic:blipFill>
-                    <a:blip r:embed="rId14"/>
-                    <a:stretch>
-                      <a:fillRect/>
-                    </a:stretch>
-                  </pic:blipFill>
-                  <pic:spPr>
-                    <a:xfrm>
-                      <a:off x="0" y="0"/>
-                      <a:ext cx="5486400" cy="5407497"/>
-                    </a:xfrm>
-                    <a:prstGeom prst="rect"/>
-                  </pic:spPr>
-                </pic:pic>
-              </a:graphicData>
-            </a:graphic>
-          </wp:inline>
-        </w:drawing>
-      </w:r>
-    </w:p>
-    <w:p>
-      <w:pPr>
-        <w:spacing w:before="80" w:after="240"/>
-      </w:pPr>
-      <w:r>
-        <w:rPr>
-          <w:i/>
-          <w:color w:val="6E7784"/>
-          <w:sz w:val="17"/>
-        </w:rPr>
-        <w:t>The register file selected across the die. All 992 flip-flops matching datapath/registers_RF_reg, which is 31 architectural registers of 32 bits each, x0 costing nothing because it is hardwired to zero.</w:t>
-      </w:r>
-    </w:p>
-    <w:p>
-      <w:pPr>
-        <w:spacing w:before="160" w:after="40"/>
-        <w:jc w:val="center"/>
-      </w:pPr>
-      <w:r>
-        <w:drawing>
-          <wp:inline xmlns:a="http://schemas.openxmlformats.org/drawingml/2006/main" xmlns:pic="http://schemas.openxmlformats.org/drawingml/2006/picture">
-            <wp:extent cx="5486400" cy="5407497"/>
-            <wp:docPr id="6" name="Picture 6"/>
-            <wp:cNvGraphicFramePr>
-              <a:graphicFrameLocks noChangeAspect="1"/>
-            </wp:cNvGraphicFramePr>
-            <a:graphic>
-              <a:graphicData uri="http://schemas.openxmlformats.org/drawingml/2006/picture">
-                <pic:pic>
-                  <pic:nvPicPr>
-                    <pic:cNvPr id="0" name="clock-tree.png"/>
-                    <pic:cNvPicPr/>
-                  </pic:nvPicPr>
-                  <pic:blipFill>
-                    <a:blip r:embed="rId15"/>
-                    <a:stretch>
-                      <a:fillRect/>
-                    </a:stretch>
-                  </pic:blipFill>
-                  <pic:spPr>
-                    <a:xfrm>
-                      <a:off x="0" y="0"/>
-                      <a:ext cx="5486400" cy="5407497"/>
-                    </a:xfrm>
-                    <a:prstGeom prst="rect"/>
-                  </pic:spPr>
-                </pic:pic>
-              </a:graphicData>
-            </a:graphic>
-          </wp:inline>
-        </w:drawing>
-      </w:r>
-    </w:p>
-    <w:p>
-      <w:pPr>
-        <w:spacing w:before="80" w:after="240"/>
-      </w:pPr>
-      <w:r>
-        <w:rPr>
-          <w:i/>
-          <w:color w:val="6E7784"/>
-          <w:sz w:val="17"/>
-        </w:rPr>
-        <w:t>The synthesised clock tree driving every flip-flop in the design.</w:t>
+        <w:t>Figure 6. The register file selected across the die. All 992 flip-flops matching datapath/registers_RF_reg, which is 31 architectural registers of 32 bits each, x0 costing nothing because it is hardwired to zero.</w:t>
       </w:r>
     </w:p>
     <w:p>
@@ -3533,12 +3637,12 @@
         </w:tblBorders>
       </w:tblPr>
       <w:tblGrid>
-        <w:gridCol w:w="9072"/>
+        <w:gridCol w:w="9360"/>
       </w:tblGrid>
       <w:tr>
         <w:tc>
           <w:tcPr>
-            <w:tcW w:type="dxa" w:w="9072"/>
+            <w:tcW w:type="dxa" w:w="9360"/>
             <w:shd w:val="clear" w:color="auto" w:fill="F4F6F8"/>
           </w:tcPr>
           <w:p>
@@ -3617,7 +3721,7 @@
     </w:p>
     <w:p>
       <w:pPr>
-        <w:spacing w:before="280"/>
+        <w:spacing w:before="160"/>
         <w:pBdr>
           <w:bottom w:val="single" w:sz="12" w:space="1" w:color="14181D"/>
         </w:pBdr>
@@ -3633,20 +3737,7 @@
           <w:color w:val="6E7784"/>
           <w:sz w:val="16"/>
         </w:rPr>
-        <w:t>Generated from 00-baseline by scripts/make_report.py.</w:t>
-      </w:r>
-    </w:p>
-    <w:p>
-      <w:pPr>
-        <w:spacing w:after="20"/>
-      </w:pPr>
-      <w:r>
-        <w:rPr>
-          <w:rFonts w:ascii="Consolas" w:hAnsi="Consolas"/>
-          <w:color w:val="6E7784"/>
-          <w:sz w:val="16"/>
-        </w:rPr>
-        <w:t>Numbers are parsed from the run's reports and are not transcribed.</w:t>
+        <w:t>Generated from 00-baseline by scripts/make_report.py. Numbers are parsed from the run's reports, not transcribed.</w:t>
       </w:r>
     </w:p>
     <w:p>
@@ -3665,7 +3756,7 @@
     <w:sectPr>
       <w:footerReference w:type="default" r:id="rId9"/>
       <w:pgSz w:w="12240" w:h="15840"/>
-      <w:pgMar w:top="1440" w:right="1584" w:bottom="1440" w:left="1584" w:header="720" w:footer="720" w:gutter="0"/>
+      <w:pgMar w:top="1296" w:right="1440" w:bottom="1224" w:left="1440" w:header="720" w:footer="720" w:gutter="0"/>
       <w:cols w:space="720"/>
       <w:docGrid w:linePitch="360"/>
     </w:sectPr>
@@ -4066,7 +4157,8 @@
     <w:qFormat/>
     <w:rsid w:val="00FC693F"/>
     <w:pPr>
-      <w:spacing w:after="160" w:line="283" w:lineRule="auto"/>
+      <w:widowControl/>
+      <w:spacing w:after="140" w:line="271" w:lineRule="auto"/>
     </w:pPr>
     <w:rPr>
       <w:rFonts w:ascii="Cambria" w:hAnsi="Cambria" w:eastAsia="Cambria"/>
@@ -4129,7 +4221,7 @@
     <w:pPr>
       <w:keepNext/>
       <w:keepLines/>
-      <w:spacing w:before="400" w:after="120"/>
+      <w:spacing w:before="300" w:after="120"/>
       <w:outlineLvl w:val="0"/>
     </w:pPr>
     <w:rPr>
@@ -4137,7 +4229,7 @@
       <w:b/>
       <w:bCs/>
       <w:i w:val="0"/>
-      <w:color w:val="9C5A26"/>
+      <w:color w:val="7B47D4"/>
       <w:sz w:val="34"/>
       <w:szCs w:val="28"/>
     </w:rPr>
@@ -4154,7 +4246,7 @@
     <w:pPr>
       <w:keepNext/>
       <w:keepLines/>
-      <w:spacing w:before="260" w:after="120"/>
+      <w:spacing w:before="220" w:after="120"/>
       <w:outlineLvl w:val="1"/>
     </w:pPr>
     <w:rPr>
@@ -4162,7 +4254,7 @@
       <w:b/>
       <w:bCs/>
       <w:i w:val="0"/>
-      <w:color w:val="14181D"/>
+      <w:color w:val="7B47D4"/>
       <w:sz w:val="27"/>
       <w:szCs w:val="26"/>
     </w:rPr>
@@ -4179,7 +4271,7 @@
     <w:pPr>
       <w:keepNext/>
       <w:keepLines/>
-      <w:spacing w:before="260" w:after="120"/>
+      <w:spacing w:before="220" w:after="120"/>
       <w:outlineLvl w:val="2"/>
     </w:pPr>
     <w:rPr>
@@ -4187,7 +4279,7 @@
       <w:b/>
       <w:bCs/>
       <w:i w:val="0"/>
-      <w:color w:val="14181D"/>
+      <w:color w:val="6B2FC9"/>
       <w:sz w:val="23"/>
     </w:rPr>
   </w:style>

</xml_diff>